<commit_message>
Commit remaining workspace changes
</commit_message>
<xml_diff>
--- a/docs/Отзыв руководителя .docx
+++ b/docs/Отзыв руководителя .docx
@@ -1,72 +1,58 @@
 
 <file path=word/document.xml><?xml version="1.0" encoding="utf-8"?>
-<w:document xmlns:mc="http://schemas.openxmlformats.org/markup-compatibility/2006" xmlns:o="urn:schemas-microsoft-com:office:office" xmlns:r="http://schemas.openxmlformats.org/officeDocument/2006/relationships" xmlns:m="http://schemas.openxmlformats.org/officeDocument/2006/math" xmlns:v="urn:schemas-microsoft-com:vml" xmlns:wp="http://schemas.openxmlformats.org/drawingml/2006/wordprocessingDrawing" xmlns:w10="urn:schemas-microsoft-com:office:word" xmlns:w="http://schemas.openxmlformats.org/wordprocessingml/2006/main" xmlns:wne="http://schemas.microsoft.com/office/word/2006/wordml" xmlns:sl="http://schemas.openxmlformats.org/schemaLibrary/2006/main" xmlns:a="http://schemas.openxmlformats.org/drawingml/2006/main" xmlns:pic="http://schemas.openxmlformats.org/drawingml/2006/picture" xmlns:c="http://schemas.openxmlformats.org/drawingml/2006/chart" xmlns:lc="http://schemas.openxmlformats.org/drawingml/2006/lockedCanvas" xmlns:dgm="http://schemas.openxmlformats.org/drawingml/2006/diagram" xmlns:wps="http://schemas.microsoft.com/office/word/2010/wordprocessingShape" xmlns:wpg="http://schemas.microsoft.com/office/word/2010/wordprocessingGroup" xmlns:w14="http://schemas.microsoft.com/office/word/2010/wordml" xmlns:w15="http://schemas.microsoft.com/office/word/2012/wordml" xmlns:w16="http://schemas.microsoft.com/office/word/2018/wordml" xmlns:w16cex="http://schemas.microsoft.com/office/word/2018/wordml/cex" xmlns:w16cid="http://schemas.microsoft.com/office/word/2016/wordml/cid" xmlns="http://schemas.microsoft.com/office/tasks/2019/documenttasks" xmlns:cr="http://schemas.microsoft.com/office/comments/2020/reactions">
+<w:document xmlns:wpc="http://schemas.microsoft.com/office/word/2010/wordprocessingCanvas" xmlns:cx="http://schemas.microsoft.com/office/drawing/2014/chartex" xmlns:cx1="http://schemas.microsoft.com/office/drawing/2015/9/8/chartex" xmlns:cx2="http://schemas.microsoft.com/office/drawing/2015/10/21/chartex" xmlns:cx3="http://schemas.microsoft.com/office/drawing/2016/5/9/chartex" xmlns:cx4="http://schemas.microsoft.com/office/drawing/2016/5/10/chartex" xmlns:cx5="http://schemas.microsoft.com/office/drawing/2016/5/11/chartex" xmlns:cx6="http://schemas.microsoft.com/office/drawing/2016/5/12/chartex" xmlns:cx7="http://schemas.microsoft.com/office/drawing/2016/5/13/chartex" xmlns:cx8="http://schemas.microsoft.com/office/drawing/2016/5/14/chartex" xmlns:mc="http://schemas.openxmlformats.org/markup-compatibility/2006" xmlns:aink="http://schemas.microsoft.com/office/drawing/2016/ink" xmlns:am3d="http://schemas.microsoft.com/office/drawing/2017/model3d" xmlns:o="urn:schemas-microsoft-com:office:office" xmlns:oel="http://schemas.microsoft.com/office/2019/extlst" xmlns:r="http://schemas.openxmlformats.org/officeDocument/2006/relationships" xmlns:m="http://schemas.openxmlformats.org/officeDocument/2006/math" xmlns:v="urn:schemas-microsoft-com:vml" xmlns:wp14="http://schemas.microsoft.com/office/word/2010/wordprocessingDrawing" xmlns:wp="http://schemas.openxmlformats.org/drawingml/2006/wordprocessingDrawing" xmlns:w10="urn:schemas-microsoft-com:office:word" xmlns:w="http://schemas.openxmlformats.org/wordprocessingml/2006/main" xmlns:w14="http://schemas.microsoft.com/office/word/2010/wordml" xmlns:w15="http://schemas.microsoft.com/office/word/2012/wordml" xmlns:w16cex="http://schemas.microsoft.com/office/word/2018/wordml/cex" xmlns:w16cid="http://schemas.microsoft.com/office/word/2016/wordml/cid" xmlns:w16="http://schemas.microsoft.com/office/word/2018/wordml" xmlns:w16du="http://schemas.microsoft.com/office/word/2023/wordml/word16du" xmlns:w16sdtdh="http://schemas.microsoft.com/office/word/2020/wordml/sdtdatahash" xmlns:w16sdtfl="http://schemas.microsoft.com/office/word/2024/wordml/sdtformatlock" xmlns:w16se="http://schemas.microsoft.com/office/word/2015/wordml/symex" xmlns:wpg="http://schemas.microsoft.com/office/word/2010/wordprocessingGroup" xmlns:wpi="http://schemas.microsoft.com/office/word/2010/wordprocessingInk" xmlns:wne="http://schemas.microsoft.com/office/word/2006/wordml" xmlns:wps="http://schemas.microsoft.com/office/word/2010/wordprocessingShape" mc:Ignorable="w14 w15 w16se w16cid w16 w16cex w16sdtdh w16sdtfl w16du wp14">
   <w:body>
     <w:p>
       <w:pPr>
         <w:jc w:val="center"/>
-        <w:rPr/>
-      </w:pPr>
-      <w:r>
-        <w:rPr>
-          <w:rtl w:val="0"/>
-        </w:rPr>
-        <w:t xml:space="preserve">ОТЗЫВ</w:t>
+      </w:pPr>
+      <w:r>
+        <w:t>ОТЗЫВ</w:t>
       </w:r>
     </w:p>
     <w:p>
       <w:pPr>
         <w:jc w:val="both"/>
-        <w:rPr/>
-      </w:pPr>
-      <w:r>
-        <w:rPr>
-          <w:rtl w:val="0"/>
-        </w:rPr>
-      </w:r>
+      </w:pPr>
     </w:p>
     <w:p>
       <w:pPr>
         <w:spacing w:line="360" w:lineRule="auto"/>
         <w:jc w:val="both"/>
-        <w:rPr/>
-      </w:pPr>
-      <w:r>
-        <w:rPr>
-          <w:rtl w:val="0"/>
-        </w:rPr>
+      </w:pPr>
+      <w:r>
         <w:t xml:space="preserve">ФИО </w:t>
       </w:r>
       <w:r>
         <w:rPr>
-          <w:rtl w:val="0"/>
-        </w:rPr>
-        <w:t xml:space="preserve">ФИО студента, </w:t>
+          <w:lang w:val="ru-RU"/>
+        </w:rPr>
+        <w:t>Мирошниченко Егор Юрьевич</w:t>
+      </w:r>
+      <w:r>
+        <w:t xml:space="preserve">, </w:t>
       </w:r>
     </w:p>
     <w:p>
       <w:pPr>
         <w:spacing w:line="360" w:lineRule="auto"/>
         <w:jc w:val="both"/>
-        <w:rPr/>
-      </w:pPr>
-      <w:r>
-        <w:rPr>
-          <w:rtl w:val="0"/>
-        </w:rPr>
-        <w:t xml:space="preserve">Вид практики: Учебная  практика</w:t>
-      </w:r>
+      </w:pPr>
+      <w:r>
+        <w:t xml:space="preserve">Вид практики: </w:t>
+      </w:r>
+      <w:proofErr w:type="gramStart"/>
+      <w:r>
+        <w:t>Учебная  практика</w:t>
+      </w:r>
+      <w:proofErr w:type="gramEnd"/>
     </w:p>
     <w:p>
       <w:pPr>
         <w:spacing w:line="360" w:lineRule="auto"/>
         <w:jc w:val="both"/>
-        <w:rPr/>
-      </w:pPr>
-      <w:r>
-        <w:rPr>
-          <w:rtl w:val="0"/>
-        </w:rPr>
+      </w:pPr>
+      <w:r>
         <w:t xml:space="preserve">Тип практики: Учебная практика, ознакомительная </w:t>
       </w:r>
     </w:p>
@@ -74,120 +60,105 @@
       <w:pPr>
         <w:spacing w:line="360" w:lineRule="auto"/>
         <w:jc w:val="both"/>
-        <w:rPr/>
-      </w:pPr>
-      <w:r>
-        <w:rPr>
-          <w:rtl w:val="0"/>
-        </w:rPr>
-        <w:t xml:space="preserve">Организация: УрФУ ИнФО кафедра интеллектуальных информационных технологий</w:t>
+      </w:pPr>
+      <w:r>
+        <w:t xml:space="preserve">Организация: УрФУ </w:t>
+      </w:r>
+      <w:proofErr w:type="spellStart"/>
+      <w:r>
+        <w:t>ИнФО</w:t>
+      </w:r>
+      <w:proofErr w:type="spellEnd"/>
+      <w:r>
+        <w:t xml:space="preserve"> кафедра интеллектуальных информационных технологий</w:t>
       </w:r>
     </w:p>
     <w:p>
       <w:pPr>
         <w:spacing w:line="360" w:lineRule="auto"/>
         <w:jc w:val="both"/>
-        <w:rPr/>
-      </w:pPr>
-      <w:r>
-        <w:rPr>
-          <w:rtl w:val="0"/>
-        </w:rPr>
-      </w:r>
+      </w:pPr>
     </w:p>
     <w:p>
       <w:pPr>
         <w:spacing w:line="360" w:lineRule="auto"/>
         <w:jc w:val="both"/>
-        <w:rPr/>
-      </w:pPr>
-      <w:r>
-        <w:rPr>
-          <w:rtl w:val="0"/>
-        </w:rPr>
-      </w:r>
+      </w:pPr>
     </w:p>
     <w:p>
       <w:pPr>
         <w:pBdr>
-          <w:top w:space="0" w:sz="0" w:val="nil"/>
-          <w:left w:space="0" w:sz="0" w:val="nil"/>
-          <w:bottom w:space="0" w:sz="0" w:val="nil"/>
-          <w:right w:space="0" w:sz="0" w:val="nil"/>
-          <w:between w:space="0" w:sz="0" w:val="nil"/>
+          <w:top w:val="nil"/>
+          <w:left w:val="nil"/>
+          <w:bottom w:val="nil"/>
+          <w:right w:val="nil"/>
+          <w:between w:val="nil"/>
         </w:pBdr>
         <w:spacing w:line="360" w:lineRule="auto"/>
-        <w:rPr/>
-      </w:pPr>
-      <w:bookmarkStart w:colFirst="0" w:colLast="0" w:name="_heading=h.yli8ti3xhfgz" w:id="0"/>
+      </w:pPr>
+      <w:bookmarkStart w:id="0" w:name="_heading=h.yli8ti3xhfgz" w:colFirst="0" w:colLast="0"/>
       <w:bookmarkEnd w:id="0"/>
       <w:r>
-        <w:rPr>
-          <w:rtl w:val="0"/>
-        </w:rPr>
-        <w:t xml:space="preserve">с 29.06.2026  по 12.07.2026</w:t>
+        <w:t xml:space="preserve">с </w:t>
+      </w:r>
+      <w:proofErr w:type="gramStart"/>
+      <w:r>
+        <w:t>29.06.2026  по</w:t>
+      </w:r>
+      <w:proofErr w:type="gramEnd"/>
+      <w:r>
+        <w:t xml:space="preserve"> 12.07.2026</w:t>
       </w:r>
     </w:p>
     <w:p>
       <w:pPr>
         <w:pBdr>
-          <w:top w:space="0" w:sz="0" w:val="nil"/>
-          <w:left w:space="0" w:sz="0" w:val="nil"/>
-          <w:bottom w:space="0" w:sz="0" w:val="nil"/>
-          <w:right w:space="0" w:sz="0" w:val="nil"/>
-          <w:between w:space="0" w:sz="0" w:val="nil"/>
+          <w:top w:val="nil"/>
+          <w:left w:val="nil"/>
+          <w:bottom w:val="nil"/>
+          <w:right w:val="nil"/>
+          <w:between w:val="nil"/>
         </w:pBdr>
-        <w:rPr/>
-      </w:pPr>
-      <w:r>
-        <w:rPr>
-          <w:rtl w:val="0"/>
-        </w:rPr>
-      </w:r>
+      </w:pPr>
     </w:p>
     <w:p>
       <w:pPr>
         <w:spacing w:line="360" w:lineRule="auto"/>
         <w:ind w:right="147"/>
         <w:jc w:val="both"/>
-        <w:rPr/>
-      </w:pPr>
-      <w:r>
-        <w:rPr>
-          <w:rtl w:val="0"/>
-        </w:rPr>
-        <w:t xml:space="preserve">Студент(ка) ФИО группы </w:t>
-      </w:r>
-      <w:r>
-        <w:rPr>
-          <w:rtl w:val="0"/>
-        </w:rPr>
-        <w:t xml:space="preserve">РИ-240938 </w:t>
-      </w:r>
-      <w:r>
-        <w:rPr>
-          <w:rtl w:val="0"/>
-        </w:rPr>
-        <w:t xml:space="preserve">института ИРИТ-РТФ за время прохождения практики осуществил(а) следующие мероприятия</w:t>
+      </w:pPr>
+      <w:r>
+        <w:t xml:space="preserve">Студент </w:t>
+      </w:r>
+      <w:r>
+        <w:rPr>
+          <w:lang w:val="ru-RU"/>
+        </w:rPr>
+        <w:t>Мирошниченко Егор Юрьевич</w:t>
+      </w:r>
+      <w:r>
+        <w:t xml:space="preserve"> группы РИ-240</w:t>
+      </w:r>
+      <w:r>
+        <w:rPr>
+          <w:lang w:val="ru-RU"/>
+        </w:rPr>
+        <w:t>914</w:t>
+      </w:r>
+      <w:r>
+        <w:t xml:space="preserve"> института ИРИТ-РТФ за время прохождения практики осуществил следующие мероприятия</w:t>
       </w:r>
     </w:p>
     <w:p>
       <w:pPr>
         <w:spacing w:line="360" w:lineRule="auto"/>
         <w:jc w:val="both"/>
-        <w:rPr/>
       </w:pPr>
       <w:r>
         <w:rPr>
           <w:u w:val="single"/>
-          <w:rtl w:val="0"/>
-        </w:rPr>
-        <w:t xml:space="preserve">____________________________________________________________________________________________________________________________________________________________________________________________________________________________________________________________________________________________________________________</w:t>
-      </w:r>
-      <w:r>
-        <w:rPr>
-          <w:rtl w:val="0"/>
-        </w:rPr>
+        </w:rPr>
+        <w:t>____________________________________________________________________________________________________________________________________________________________________________________________________________________________________________________________________________________________________________________</w:t>
       </w:r>
     </w:p>
     <w:p>
@@ -198,17 +169,13 @@
         </w:rPr>
       </w:pPr>
       <w:r>
-        <w:rPr>
-          <w:rtl w:val="0"/>
-        </w:rPr>
-        <w:t xml:space="preserve">В период практики студент(ка) </w:t>
+        <w:t xml:space="preserve">В период практики студент </w:t>
       </w:r>
       <w:r>
         <w:rPr>
           <w:u w:val="single"/>
-          <w:rtl w:val="0"/>
-        </w:rPr>
-        <w:t xml:space="preserve">_________________________________________________________________________________________________________________________________________________________________________________________________________________________________________________________________________________________________________________________________________________________________________________________________</w:t>
+        </w:rPr>
+        <w:t>_________________________________________________________________________________________________________________________________________________________________________________________________________________________________________________________________________________________________________________________________________________________________________________________________</w:t>
       </w:r>
     </w:p>
     <w:p>
@@ -221,9 +188,8 @@
       <w:r>
         <w:rPr>
           <w:u w:val="single"/>
-          <w:rtl w:val="0"/>
-        </w:rPr>
-        <w:t xml:space="preserve">_____________________________________________________________________________</w:t>
+        </w:rPr>
+        <w:t>_____________________________________________________________________________</w:t>
       </w:r>
     </w:p>
     <w:p>
@@ -235,16 +201,12 @@
         </w:rPr>
       </w:pPr>
       <w:r>
-        <w:rPr>
-          <w:rtl w:val="0"/>
-        </w:rPr>
         <w:t xml:space="preserve">                      </w:t>
       </w:r>
       <w:r>
         <w:rPr>
           <w:sz w:val="20"/>
           <w:szCs w:val="20"/>
-          <w:rtl w:val="0"/>
         </w:rPr>
         <w:t xml:space="preserve"> (краткая характеристика уровня подготовки и отношения практиканта к работе)</w:t>
       </w:r>
@@ -252,76 +214,41 @@
     <w:p>
       <w:pPr>
         <w:pBdr>
-          <w:top w:space="0" w:sz="0" w:val="nil"/>
-          <w:left w:space="0" w:sz="0" w:val="nil"/>
-          <w:bottom w:space="0" w:sz="0" w:val="nil"/>
-          <w:right w:space="0" w:sz="0" w:val="nil"/>
-          <w:between w:space="0" w:sz="0" w:val="nil"/>
+          <w:top w:val="nil"/>
+          <w:left w:val="nil"/>
+          <w:bottom w:val="nil"/>
+          <w:right w:val="nil"/>
+          <w:between w:val="nil"/>
         </w:pBdr>
-        <w:rPr/>
-      </w:pPr>
-      <w:r>
-        <w:rPr>
-          <w:rtl w:val="0"/>
-        </w:rPr>
-      </w:r>
-    </w:p>
-    <w:p>
-      <w:pPr>
-        <w:rPr/>
-      </w:pPr>
-      <w:r>
-        <w:rPr>
-          <w:rtl w:val="0"/>
-        </w:rPr>
-      </w:r>
-    </w:p>
-    <w:p>
-      <w:pPr>
-        <w:spacing w:line="360" w:lineRule="auto"/>
-        <w:rPr/>
-      </w:pPr>
-      <w:r>
-        <w:rPr>
-          <w:rtl w:val="0"/>
-        </w:rPr>
+      </w:pPr>
+    </w:p>
+    <w:p/>
+    <w:p>
+      <w:pPr>
+        <w:spacing w:line="360" w:lineRule="auto"/>
+      </w:pPr>
+      <w:r>
         <w:t xml:space="preserve">Оценка за практику </w:t>
       </w:r>
       <w:r>
         <w:rPr>
           <w:u w:val="single"/>
-          <w:rtl w:val="0"/>
-        </w:rPr>
-        <w:t xml:space="preserve">_______</w:t>
-      </w:r>
-      <w:r>
-        <w:rPr>
-          <w:rtl w:val="0"/>
-        </w:rPr>
-      </w:r>
-    </w:p>
-    <w:p>
-      <w:pPr>
-        <w:spacing w:line="360" w:lineRule="auto"/>
-        <w:rPr/>
-      </w:pPr>
-      <w:r>
-        <w:rPr>
-          <w:rtl w:val="0"/>
-        </w:rPr>
-        <w:t xml:space="preserve">«10» июля 2026 г.</w:t>
-      </w:r>
-    </w:p>
-    <w:p>
-      <w:pPr>
-        <w:spacing w:line="360" w:lineRule="auto"/>
-        <w:rPr/>
-      </w:pPr>
-      <w:r>
-        <w:rPr>
-          <w:rtl w:val="0"/>
-        </w:rPr>
-      </w:r>
+        </w:rPr>
+        <w:t>_______</w:t>
+      </w:r>
+    </w:p>
+    <w:p>
+      <w:pPr>
+        <w:spacing w:line="360" w:lineRule="auto"/>
+      </w:pPr>
+      <w:r>
+        <w:t>«10» июля 2026 г.</w:t>
+      </w:r>
+    </w:p>
+    <w:p>
+      <w:pPr>
+        <w:spacing w:line="360" w:lineRule="auto"/>
+      </w:pPr>
     </w:p>
     <w:p>
       <w:pPr>
@@ -332,16 +259,12 @@
         </w:rPr>
       </w:pPr>
       <w:r>
-        <w:rPr>
-          <w:rtl w:val="0"/>
-        </w:rPr>
         <w:t xml:space="preserve">Руководитель практики                                     </w:t>
       </w:r>
       <w:r>
         <w:rPr>
           <w:sz w:val="22"/>
           <w:szCs w:val="22"/>
-          <w:rtl w:val="0"/>
         </w:rPr>
         <w:t xml:space="preserve">__________                 </w:t>
       </w:r>
@@ -350,21 +273,23 @@
           <w:sz w:val="22"/>
           <w:szCs w:val="22"/>
           <w:u w:val="single"/>
-          <w:rtl w:val="0"/>
-        </w:rPr>
-        <w:t xml:space="preserve"> ФИО руководителя </w:t>
-      </w:r>
-      <w:r>
-        <w:rPr>
-          <w:rtl w:val="0"/>
-        </w:rPr>
-      </w:r>
-    </w:p>
-    <w:p>
-      <w:pPr>
-        <w:spacing w:line="360" w:lineRule="auto"/>
-        <w:rPr>
-          <w:color w:val="0070c0"/>
+        </w:rPr>
+        <w:t xml:space="preserve"> </w:t>
+      </w:r>
+      <w:r>
+        <w:rPr>
+          <w:sz w:val="22"/>
+          <w:szCs w:val="22"/>
+          <w:u w:val="single"/>
+        </w:rPr>
+        <w:t>Мелехин А. В.</w:t>
+      </w:r>
+    </w:p>
+    <w:p>
+      <w:pPr>
+        <w:spacing w:line="360" w:lineRule="auto"/>
+        <w:rPr>
+          <w:color w:val="0070C0"/>
         </w:rPr>
       </w:pPr>
       <w:r>
@@ -372,7 +297,6 @@
           <w:sz w:val="16"/>
           <w:szCs w:val="16"/>
           <w:vertAlign w:val="superscript"/>
-          <w:rtl w:val="0"/>
         </w:rPr>
         <w:t xml:space="preserve">                                                                                                                                                                                                         </w:t>
       </w:r>
@@ -381,14 +305,12 @@
           <w:sz w:val="22"/>
           <w:szCs w:val="22"/>
           <w:vertAlign w:val="superscript"/>
-          <w:rtl w:val="0"/>
-        </w:rPr>
-        <w:t xml:space="preserve">Подпись                                                расшифровка подписи</w:t>
-      </w:r>
-      <w:r>
-        <w:rPr>
-          <w:color w:val="0070c0"/>
-          <w:rtl w:val="0"/>
+        </w:rPr>
+        <w:t>Подпись                                                расшифровка подписи</w:t>
+      </w:r>
+      <w:r>
+        <w:rPr>
+          <w:color w:val="0070C0"/>
         </w:rPr>
         <w:t xml:space="preserve"> </w:t>
       </w:r>
@@ -396,189 +318,611 @@
     <w:p>
       <w:pPr>
         <w:spacing w:line="360" w:lineRule="auto"/>
-        <w:rPr/>
-      </w:pPr>
-      <w:r>
-        <w:rPr>
-          <w:rtl w:val="0"/>
-        </w:rPr>
-      </w:r>
+      </w:pPr>
     </w:p>
     <w:p>
       <w:pPr>
         <w:spacing w:after="200" w:line="276" w:lineRule="auto"/>
-        <w:rPr/>
-      </w:pPr>
-      <w:r>
-        <w:rPr>
-          <w:rtl w:val="0"/>
-        </w:rPr>
-      </w:r>
+      </w:pPr>
     </w:p>
     <w:sectPr>
-      <w:pgSz w:h="16838" w:w="11906" w:orient="portrait"/>
-      <w:pgMar w:bottom="284" w:top="528" w:left="1701" w:right="850" w:header="284" w:footer="708"/>
+      <w:pgSz w:w="11906" w:h="16838"/>
+      <w:pgMar w:top="528" w:right="850" w:bottom="284" w:left="1701" w:header="284" w:footer="708" w:gutter="0"/>
       <w:pgNumType w:start="1"/>
+      <w:cols w:space="720"/>
     </w:sectPr>
   </w:body>
 </w:document>
 </file>
 
-<file path=word/numbering.xml><?xml version="1.0" encoding="utf-8"?>
-<w:numbering xmlns:mc="http://schemas.openxmlformats.org/markup-compatibility/2006" xmlns:o="urn:schemas-microsoft-com:office:office" xmlns:r="http://schemas.openxmlformats.org/officeDocument/2006/relationships" xmlns:m="http://schemas.openxmlformats.org/officeDocument/2006/math" xmlns:v="urn:schemas-microsoft-com:vml" xmlns:wp="http://schemas.openxmlformats.org/drawingml/2006/wordprocessingDrawing" xmlns:w10="urn:schemas-microsoft-com:office:word" xmlns:w="http://schemas.openxmlformats.org/wordprocessingml/2006/main" xmlns:wne="http://schemas.microsoft.com/office/word/2006/wordml" xmlns:sl="http://schemas.openxmlformats.org/schemaLibrary/2006/main" xmlns:a="http://schemas.openxmlformats.org/drawingml/2006/main" xmlns:pic="http://schemas.openxmlformats.org/drawingml/2006/picture" xmlns:c="http://schemas.openxmlformats.org/drawingml/2006/chart" xmlns:lc="http://schemas.openxmlformats.org/drawingml/2006/lockedCanvas" xmlns:dgm="http://schemas.openxmlformats.org/drawingml/2006/diagram" xmlns:wps="http://schemas.microsoft.com/office/word/2010/wordprocessingShape" xmlns:wpg="http://schemas.microsoft.com/office/word/2010/wordprocessingGroup" xmlns:w14="http://schemas.microsoft.com/office/word/2010/wordml" xmlns:w15="http://schemas.microsoft.com/office/word/2012/wordml" xmlns:w16="http://schemas.microsoft.com/office/word/2018/wordml" xmlns:w16cex="http://schemas.microsoft.com/office/word/2018/wordml/cex" xmlns:w16cid="http://schemas.microsoft.com/office/word/2016/wordml/cid" xmlns="http://schemas.microsoft.com/office/tasks/2019/documenttasks" xmlns:cr="http://schemas.microsoft.com/office/comments/2020/reactions"/>
-</file>
-
 <file path=word/styles.xml><?xml version="1.0" encoding="utf-8"?>
-<w:styles xmlns:mc="http://schemas.openxmlformats.org/markup-compatibility/2006" xmlns:o="urn:schemas-microsoft-com:office:office" xmlns:r="http://schemas.openxmlformats.org/officeDocument/2006/relationships" xmlns:m="http://schemas.openxmlformats.org/officeDocument/2006/math" xmlns:v="urn:schemas-microsoft-com:vml" xmlns:wp="http://schemas.openxmlformats.org/drawingml/2006/wordprocessingDrawing" xmlns:w10="urn:schemas-microsoft-com:office:word" xmlns:w="http://schemas.openxmlformats.org/wordprocessingml/2006/main" xmlns:wne="http://schemas.microsoft.com/office/word/2006/wordml" xmlns:sl="http://schemas.openxmlformats.org/schemaLibrary/2006/main" xmlns:a="http://schemas.openxmlformats.org/drawingml/2006/main" xmlns:pic="http://schemas.openxmlformats.org/drawingml/2006/picture" xmlns:c="http://schemas.openxmlformats.org/drawingml/2006/chart" xmlns:lc="http://schemas.openxmlformats.org/drawingml/2006/lockedCanvas" xmlns:dgm="http://schemas.openxmlformats.org/drawingml/2006/diagram" xmlns:wps="http://schemas.microsoft.com/office/word/2010/wordprocessingShape" xmlns:wpg="http://schemas.microsoft.com/office/word/2010/wordprocessingGroup" xmlns:w14="http://schemas.microsoft.com/office/word/2010/wordml" xmlns:w15="http://schemas.microsoft.com/office/word/2012/wordml" xmlns:w16="http://schemas.microsoft.com/office/word/2018/wordml" xmlns:w16cex="http://schemas.microsoft.com/office/word/2018/wordml/cex" xmlns:w16cid="http://schemas.microsoft.com/office/word/2016/wordml/cid" xmlns="http://schemas.microsoft.com/office/tasks/2019/documenttasks" xmlns:cr="http://schemas.microsoft.com/office/comments/2020/reactions">
+<w:styles xmlns:mc="http://schemas.openxmlformats.org/markup-compatibility/2006" xmlns:r="http://schemas.openxmlformats.org/officeDocument/2006/relationships" xmlns:w="http://schemas.openxmlformats.org/wordprocessingml/2006/main" xmlns:w14="http://schemas.microsoft.com/office/word/2010/wordml" xmlns:w15="http://schemas.microsoft.com/office/word/2012/wordml" xmlns:w16cex="http://schemas.microsoft.com/office/word/2018/wordml/cex" xmlns:w16cid="http://schemas.microsoft.com/office/word/2016/wordml/cid" xmlns:w16="http://schemas.microsoft.com/office/word/2018/wordml" xmlns:w16du="http://schemas.microsoft.com/office/word/2023/wordml/word16du" xmlns:w16sdtdh="http://schemas.microsoft.com/office/word/2020/wordml/sdtdatahash" xmlns:w16sdtfl="http://schemas.microsoft.com/office/word/2024/wordml/sdtformatlock" xmlns:w16se="http://schemas.microsoft.com/office/word/2015/wordml/symex" mc:Ignorable="w14 w15 w16se w16cid w16 w16cex w16sdtdh w16sdtfl w16du">
   <w:docDefaults>
     <w:rPrDefault>
       <w:rPr>
+        <w:rFonts w:ascii="Times New Roman" w:eastAsia="Times New Roman" w:hAnsi="Times New Roman" w:cs="Times New Roman"/>
         <w:sz w:val="24"/>
         <w:szCs w:val="24"/>
-        <w:lang w:val="ru"/>
+        <w:lang w:val="ru" w:eastAsia="ru-RU" w:bidi="ar-SA"/>
       </w:rPr>
     </w:rPrDefault>
-    <w:pPrDefault>
-      <w:pPr/>
-    </w:pPrDefault>
+    <w:pPrDefault/>
   </w:docDefaults>
-  <w:style w:type="table" w:styleId="TableNormal" w:default="1">
-    <w:name w:val="TableNormal"/>
-    <w:tblPr>
-      <w:tblCellMar>
-        <w:top w:w="100.0" w:type="dxa"/>
-        <w:left w:w="100.0" w:type="dxa"/>
-        <w:bottom w:w="100.0" w:type="dxa"/>
-        <w:right w:w="100.0" w:type="dxa"/>
-      </w:tblCellMar>
-    </w:tblPr>
+  <w:latentStyles w:defLockedState="0" w:defUIPriority="99" w:defSemiHidden="0" w:defUnhideWhenUsed="0" w:defQFormat="0" w:count="376">
+    <w:lsdException w:name="Normal" w:uiPriority="0" w:qFormat="1"/>
+    <w:lsdException w:name="heading 1" w:uiPriority="9" w:qFormat="1"/>
+    <w:lsdException w:name="heading 2" w:semiHidden="1" w:uiPriority="9" w:unhideWhenUsed="1" w:qFormat="1"/>
+    <w:lsdException w:name="heading 3" w:semiHidden="1" w:uiPriority="9" w:unhideWhenUsed="1" w:qFormat="1"/>
+    <w:lsdException w:name="heading 4" w:semiHidden="1" w:uiPriority="9" w:unhideWhenUsed="1" w:qFormat="1"/>
+    <w:lsdException w:name="heading 5" w:semiHidden="1" w:uiPriority="9" w:unhideWhenUsed="1" w:qFormat="1"/>
+    <w:lsdException w:name="heading 6" w:semiHidden="1" w:uiPriority="9" w:unhideWhenUsed="1" w:qFormat="1"/>
+    <w:lsdException w:name="heading 7" w:semiHidden="1" w:uiPriority="9" w:unhideWhenUsed="1" w:qFormat="1"/>
+    <w:lsdException w:name="heading 8" w:semiHidden="1" w:uiPriority="9" w:unhideWhenUsed="1" w:qFormat="1"/>
+    <w:lsdException w:name="heading 9" w:semiHidden="1" w:uiPriority="9" w:unhideWhenUsed="1" w:qFormat="1"/>
+    <w:lsdException w:name="index 1" w:semiHidden="1" w:unhideWhenUsed="1"/>
+    <w:lsdException w:name="index 2" w:semiHidden="1" w:unhideWhenUsed="1"/>
+    <w:lsdException w:name="index 3" w:semiHidden="1" w:unhideWhenUsed="1"/>
+    <w:lsdException w:name="index 4" w:semiHidden="1" w:unhideWhenUsed="1"/>
+    <w:lsdException w:name="index 5" w:semiHidden="1" w:unhideWhenUsed="1"/>
+    <w:lsdException w:name="index 6" w:semiHidden="1" w:unhideWhenUsed="1"/>
+    <w:lsdException w:name="index 7" w:semiHidden="1" w:unhideWhenUsed="1"/>
+    <w:lsdException w:name="index 8" w:semiHidden="1" w:unhideWhenUsed="1"/>
+    <w:lsdException w:name="index 9" w:semiHidden="1" w:unhideWhenUsed="1"/>
+    <w:lsdException w:name="toc 1" w:semiHidden="1" w:uiPriority="39" w:unhideWhenUsed="1"/>
+    <w:lsdException w:name="toc 2" w:semiHidden="1" w:uiPriority="39" w:unhideWhenUsed="1"/>
+    <w:lsdException w:name="toc 3" w:semiHidden="1" w:uiPriority="39" w:unhideWhenUsed="1"/>
+    <w:lsdException w:name="toc 4" w:semiHidden="1" w:uiPriority="39" w:unhideWhenUsed="1"/>
+    <w:lsdException w:name="toc 5" w:semiHidden="1" w:uiPriority="39" w:unhideWhenUsed="1"/>
+    <w:lsdException w:name="toc 6" w:semiHidden="1" w:uiPriority="39" w:unhideWhenUsed="1"/>
+    <w:lsdException w:name="toc 7" w:semiHidden="1" w:uiPriority="39" w:unhideWhenUsed="1"/>
+    <w:lsdException w:name="toc 8" w:semiHidden="1" w:uiPriority="39" w:unhideWhenUsed="1"/>
+    <w:lsdException w:name="toc 9" w:semiHidden="1" w:uiPriority="39" w:unhideWhenUsed="1"/>
+    <w:lsdException w:name="Normal Indent" w:semiHidden="1" w:unhideWhenUsed="1"/>
+    <w:lsdException w:name="footnote text" w:semiHidden="1" w:unhideWhenUsed="1"/>
+    <w:lsdException w:name="annotation text" w:semiHidden="1" w:unhideWhenUsed="1"/>
+    <w:lsdException w:name="header" w:semiHidden="1" w:unhideWhenUsed="1"/>
+    <w:lsdException w:name="footer" w:semiHidden="1" w:unhideWhenUsed="1"/>
+    <w:lsdException w:name="index heading" w:semiHidden="1" w:unhideWhenUsed="1"/>
+    <w:lsdException w:name="caption" w:semiHidden="1" w:uiPriority="35" w:unhideWhenUsed="1" w:qFormat="1"/>
+    <w:lsdException w:name="table of figures" w:semiHidden="1" w:unhideWhenUsed="1"/>
+    <w:lsdException w:name="envelope address" w:semiHidden="1" w:unhideWhenUsed="1"/>
+    <w:lsdException w:name="envelope return" w:semiHidden="1" w:unhideWhenUsed="1"/>
+    <w:lsdException w:name="footnote reference" w:semiHidden="1" w:unhideWhenUsed="1"/>
+    <w:lsdException w:name="annotation reference" w:semiHidden="1" w:unhideWhenUsed="1"/>
+    <w:lsdException w:name="line number" w:semiHidden="1" w:unhideWhenUsed="1"/>
+    <w:lsdException w:name="page number" w:semiHidden="1" w:unhideWhenUsed="1"/>
+    <w:lsdException w:name="endnote reference" w:semiHidden="1" w:unhideWhenUsed="1"/>
+    <w:lsdException w:name="endnote text" w:semiHidden="1" w:unhideWhenUsed="1"/>
+    <w:lsdException w:name="table of authorities" w:semiHidden="1" w:unhideWhenUsed="1"/>
+    <w:lsdException w:name="macro" w:semiHidden="1" w:unhideWhenUsed="1"/>
+    <w:lsdException w:name="toa heading" w:semiHidden="1" w:unhideWhenUsed="1"/>
+    <w:lsdException w:name="List" w:semiHidden="1" w:unhideWhenUsed="1"/>
+    <w:lsdException w:name="List Bullet" w:semiHidden="1" w:unhideWhenUsed="1"/>
+    <w:lsdException w:name="List Number" w:semiHidden="1" w:unhideWhenUsed="1"/>
+    <w:lsdException w:name="List 2" w:semiHidden="1" w:unhideWhenUsed="1"/>
+    <w:lsdException w:name="List 3" w:semiHidden="1" w:unhideWhenUsed="1"/>
+    <w:lsdException w:name="List 4" w:semiHidden="1" w:unhideWhenUsed="1"/>
+    <w:lsdException w:name="List 5" w:semiHidden="1" w:unhideWhenUsed="1"/>
+    <w:lsdException w:name="List Bullet 2" w:semiHidden="1" w:unhideWhenUsed="1"/>
+    <w:lsdException w:name="List Bullet 3" w:semiHidden="1" w:unhideWhenUsed="1"/>
+    <w:lsdException w:name="List Bullet 4" w:semiHidden="1" w:unhideWhenUsed="1"/>
+    <w:lsdException w:name="List Bullet 5" w:semiHidden="1" w:unhideWhenUsed="1"/>
+    <w:lsdException w:name="List Number 2" w:semiHidden="1" w:unhideWhenUsed="1"/>
+    <w:lsdException w:name="List Number 3" w:semiHidden="1" w:unhideWhenUsed="1"/>
+    <w:lsdException w:name="List Number 4" w:semiHidden="1" w:unhideWhenUsed="1"/>
+    <w:lsdException w:name="List Number 5" w:semiHidden="1" w:unhideWhenUsed="1"/>
+    <w:lsdException w:name="Title" w:uiPriority="10" w:qFormat="1"/>
+    <w:lsdException w:name="Closing" w:semiHidden="1" w:unhideWhenUsed="1"/>
+    <w:lsdException w:name="Signature" w:semiHidden="1" w:unhideWhenUsed="1"/>
+    <w:lsdException w:name="Default Paragraph Font" w:semiHidden="1" w:uiPriority="1" w:unhideWhenUsed="1"/>
+    <w:lsdException w:name="Body Text" w:semiHidden="1" w:unhideWhenUsed="1"/>
+    <w:lsdException w:name="Body Text Indent" w:semiHidden="1" w:unhideWhenUsed="1"/>
+    <w:lsdException w:name="List Continue" w:semiHidden="1" w:unhideWhenUsed="1"/>
+    <w:lsdException w:name="List Continue 2" w:semiHidden="1" w:unhideWhenUsed="1"/>
+    <w:lsdException w:name="List Continue 3" w:semiHidden="1" w:unhideWhenUsed="1"/>
+    <w:lsdException w:name="List Continue 4" w:semiHidden="1" w:unhideWhenUsed="1"/>
+    <w:lsdException w:name="List Continue 5" w:semiHidden="1" w:unhideWhenUsed="1"/>
+    <w:lsdException w:name="Message Header" w:semiHidden="1" w:unhideWhenUsed="1"/>
+    <w:lsdException w:name="Subtitle" w:uiPriority="11" w:qFormat="1"/>
+    <w:lsdException w:name="Salutation" w:semiHidden="1" w:unhideWhenUsed="1"/>
+    <w:lsdException w:name="Date" w:semiHidden="1" w:unhideWhenUsed="1"/>
+    <w:lsdException w:name="Body Text First Indent" w:semiHidden="1" w:unhideWhenUsed="1"/>
+    <w:lsdException w:name="Body Text First Indent 2" w:semiHidden="1" w:unhideWhenUsed="1"/>
+    <w:lsdException w:name="Note Heading" w:semiHidden="1" w:unhideWhenUsed="1"/>
+    <w:lsdException w:name="Body Text 2" w:semiHidden="1" w:unhideWhenUsed="1"/>
+    <w:lsdException w:name="Body Text 3" w:semiHidden="1" w:unhideWhenUsed="1"/>
+    <w:lsdException w:name="Body Text Indent 2" w:semiHidden="1" w:unhideWhenUsed="1"/>
+    <w:lsdException w:name="Body Text Indent 3" w:semiHidden="1" w:unhideWhenUsed="1"/>
+    <w:lsdException w:name="Block Text" w:semiHidden="1" w:unhideWhenUsed="1"/>
+    <w:lsdException w:name="Hyperlink" w:semiHidden="1" w:unhideWhenUsed="1"/>
+    <w:lsdException w:name="FollowedHyperlink" w:semiHidden="1" w:unhideWhenUsed="1"/>
+    <w:lsdException w:name="Strong" w:uiPriority="22" w:qFormat="1"/>
+    <w:lsdException w:name="Emphasis" w:uiPriority="20" w:qFormat="1"/>
+    <w:lsdException w:name="Document Map" w:semiHidden="1" w:unhideWhenUsed="1"/>
+    <w:lsdException w:name="Plain Text" w:semiHidden="1" w:unhideWhenUsed="1"/>
+    <w:lsdException w:name="E-mail Signature" w:semiHidden="1" w:unhideWhenUsed="1"/>
+    <w:lsdException w:name="HTML Top of Form" w:semiHidden="1" w:unhideWhenUsed="1"/>
+    <w:lsdException w:name="HTML Bottom of Form" w:semiHidden="1" w:unhideWhenUsed="1"/>
+    <w:lsdException w:name="Normal (Web)" w:semiHidden="1" w:unhideWhenUsed="1"/>
+    <w:lsdException w:name="HTML Acronym" w:semiHidden="1" w:unhideWhenUsed="1"/>
+    <w:lsdException w:name="HTML Address" w:semiHidden="1" w:unhideWhenUsed="1"/>
+    <w:lsdException w:name="HTML Cite" w:semiHidden="1" w:unhideWhenUsed="1"/>
+    <w:lsdException w:name="HTML Code" w:semiHidden="1" w:unhideWhenUsed="1"/>
+    <w:lsdException w:name="HTML Definition" w:semiHidden="1" w:unhideWhenUsed="1"/>
+    <w:lsdException w:name="HTML Keyboard" w:semiHidden="1" w:unhideWhenUsed="1"/>
+    <w:lsdException w:name="HTML Preformatted" w:semiHidden="1" w:unhideWhenUsed="1"/>
+    <w:lsdException w:name="HTML Sample" w:semiHidden="1" w:unhideWhenUsed="1"/>
+    <w:lsdException w:name="HTML Typewriter" w:semiHidden="1" w:unhideWhenUsed="1"/>
+    <w:lsdException w:name="HTML Variable" w:semiHidden="1" w:unhideWhenUsed="1"/>
+    <w:lsdException w:name="Normal Table" w:semiHidden="1" w:unhideWhenUsed="1"/>
+    <w:lsdException w:name="annotation subject" w:semiHidden="1" w:unhideWhenUsed="1"/>
+    <w:lsdException w:name="No List" w:semiHidden="1" w:unhideWhenUsed="1"/>
+    <w:lsdException w:name="Outline List 1" w:semiHidden="1" w:unhideWhenUsed="1"/>
+    <w:lsdException w:name="Outline List 2" w:semiHidden="1" w:unhideWhenUsed="1"/>
+    <w:lsdException w:name="Outline List 3" w:semiHidden="1" w:unhideWhenUsed="1"/>
+    <w:lsdException w:name="Table Simple 1" w:semiHidden="1" w:unhideWhenUsed="1"/>
+    <w:lsdException w:name="Table Simple 2" w:semiHidden="1" w:unhideWhenUsed="1"/>
+    <w:lsdException w:name="Table Simple 3" w:semiHidden="1" w:unhideWhenUsed="1"/>
+    <w:lsdException w:name="Table Classic 1" w:semiHidden="1" w:unhideWhenUsed="1"/>
+    <w:lsdException w:name="Table Classic 2" w:semiHidden="1" w:unhideWhenUsed="1"/>
+    <w:lsdException w:name="Table Classic 3" w:semiHidden="1" w:unhideWhenUsed="1"/>
+    <w:lsdException w:name="Table Classic 4" w:semiHidden="1" w:unhideWhenUsed="1"/>
+    <w:lsdException w:name="Table Colorful 1" w:semiHidden="1" w:unhideWhenUsed="1"/>
+    <w:lsdException w:name="Table Colorful 2" w:semiHidden="1" w:unhideWhenUsed="1"/>
+    <w:lsdException w:name="Table Colorful 3" w:semiHidden="1" w:unhideWhenUsed="1"/>
+    <w:lsdException w:name="Table Columns 1" w:semiHidden="1" w:unhideWhenUsed="1"/>
+    <w:lsdException w:name="Table Columns 2" w:semiHidden="1" w:unhideWhenUsed="1"/>
+    <w:lsdException w:name="Table Columns 3" w:semiHidden="1" w:unhideWhenUsed="1"/>
+    <w:lsdException w:name="Table Columns 4" w:semiHidden="1" w:unhideWhenUsed="1"/>
+    <w:lsdException w:name="Table Columns 5" w:semiHidden="1" w:unhideWhenUsed="1"/>
+    <w:lsdException w:name="Table Grid 1" w:semiHidden="1" w:unhideWhenUsed="1"/>
+    <w:lsdException w:name="Table Grid 2" w:semiHidden="1" w:unhideWhenUsed="1"/>
+    <w:lsdException w:name="Table Grid 3" w:semiHidden="1" w:unhideWhenUsed="1"/>
+    <w:lsdException w:name="Table Grid 4" w:semiHidden="1" w:unhideWhenUsed="1"/>
+    <w:lsdException w:name="Table Grid 5" w:semiHidden="1" w:unhideWhenUsed="1"/>
+    <w:lsdException w:name="Table Grid 6" w:semiHidden="1" w:unhideWhenUsed="1"/>
+    <w:lsdException w:name="Table Grid 7" w:semiHidden="1" w:unhideWhenUsed="1"/>
+    <w:lsdException w:name="Table Grid 8" w:semiHidden="1" w:unhideWhenUsed="1"/>
+    <w:lsdException w:name="Table List 1" w:semiHidden="1" w:unhideWhenUsed="1"/>
+    <w:lsdException w:name="Table List 2" w:semiHidden="1" w:unhideWhenUsed="1"/>
+    <w:lsdException w:name="Table List 3" w:semiHidden="1" w:unhideWhenUsed="1"/>
+    <w:lsdException w:name="Table List 4" w:semiHidden="1" w:unhideWhenUsed="1"/>
+    <w:lsdException w:name="Table List 5" w:semiHidden="1" w:unhideWhenUsed="1"/>
+    <w:lsdException w:name="Table List 6" w:semiHidden="1" w:unhideWhenUsed="1"/>
+    <w:lsdException w:name="Table List 7" w:semiHidden="1" w:unhideWhenUsed="1"/>
+    <w:lsdException w:name="Table List 8" w:semiHidden="1" w:unhideWhenUsed="1"/>
+    <w:lsdException w:name="Table 3D effects 1" w:semiHidden="1" w:unhideWhenUsed="1"/>
+    <w:lsdException w:name="Table 3D effects 2" w:semiHidden="1" w:unhideWhenUsed="1"/>
+    <w:lsdException w:name="Table 3D effects 3" w:semiHidden="1" w:unhideWhenUsed="1"/>
+    <w:lsdException w:name="Table Contemporary" w:semiHidden="1" w:unhideWhenUsed="1"/>
+    <w:lsdException w:name="Table Elegant" w:semiHidden="1" w:unhideWhenUsed="1"/>
+    <w:lsdException w:name="Table Professional" w:semiHidden="1" w:unhideWhenUsed="1"/>
+    <w:lsdException w:name="Table Subtle 1" w:semiHidden="1" w:unhideWhenUsed="1"/>
+    <w:lsdException w:name="Table Subtle 2" w:semiHidden="1" w:unhideWhenUsed="1"/>
+    <w:lsdException w:name="Table Web 1" w:semiHidden="1" w:unhideWhenUsed="1"/>
+    <w:lsdException w:name="Table Web 2" w:semiHidden="1" w:unhideWhenUsed="1"/>
+    <w:lsdException w:name="Table Web 3" w:semiHidden="1" w:unhideWhenUsed="1"/>
+    <w:lsdException w:name="Balloon Text" w:semiHidden="1" w:unhideWhenUsed="1"/>
+    <w:lsdException w:name="Table Grid" w:uiPriority="39"/>
+    <w:lsdException w:name="Table Theme" w:semiHidden="1" w:unhideWhenUsed="1"/>
+    <w:lsdException w:name="Placeholder Text" w:semiHidden="1"/>
+    <w:lsdException w:name="No Spacing" w:uiPriority="1" w:qFormat="1"/>
+    <w:lsdException w:name="Light Shading" w:uiPriority="60"/>
+    <w:lsdException w:name="Light List" w:uiPriority="61"/>
+    <w:lsdException w:name="Light Grid" w:uiPriority="62"/>
+    <w:lsdException w:name="Medium Shading 1" w:uiPriority="63"/>
+    <w:lsdException w:name="Medium Shading 2" w:uiPriority="64"/>
+    <w:lsdException w:name="Medium List 1" w:uiPriority="65"/>
+    <w:lsdException w:name="Medium List 2" w:uiPriority="66"/>
+    <w:lsdException w:name="Medium Grid 1" w:uiPriority="67"/>
+    <w:lsdException w:name="Medium Grid 2" w:uiPriority="68"/>
+    <w:lsdException w:name="Medium Grid 3" w:uiPriority="69"/>
+    <w:lsdException w:name="Dark List" w:uiPriority="70"/>
+    <w:lsdException w:name="Colorful Shading" w:uiPriority="71"/>
+    <w:lsdException w:name="Colorful List" w:uiPriority="72"/>
+    <w:lsdException w:name="Colorful Grid" w:uiPriority="73"/>
+    <w:lsdException w:name="Light Shading Accent 1" w:uiPriority="60"/>
+    <w:lsdException w:name="Light List Accent 1" w:uiPriority="61"/>
+    <w:lsdException w:name="Light Grid Accent 1" w:uiPriority="62"/>
+    <w:lsdException w:name="Medium Shading 1 Accent 1" w:uiPriority="63"/>
+    <w:lsdException w:name="Medium Shading 2 Accent 1" w:uiPriority="64"/>
+    <w:lsdException w:name="Medium List 1 Accent 1" w:uiPriority="65"/>
+    <w:lsdException w:name="Revision" w:semiHidden="1"/>
+    <w:lsdException w:name="List Paragraph" w:uiPriority="34" w:qFormat="1"/>
+    <w:lsdException w:name="Quote" w:uiPriority="29" w:qFormat="1"/>
+    <w:lsdException w:name="Intense Quote" w:uiPriority="30" w:qFormat="1"/>
+    <w:lsdException w:name="Medium List 2 Accent 1" w:uiPriority="66"/>
+    <w:lsdException w:name="Medium Grid 1 Accent 1" w:uiPriority="67"/>
+    <w:lsdException w:name="Medium Grid 2 Accent 1" w:uiPriority="68"/>
+    <w:lsdException w:name="Medium Grid 3 Accent 1" w:uiPriority="69"/>
+    <w:lsdException w:name="Dark List Accent 1" w:uiPriority="70"/>
+    <w:lsdException w:name="Colorful Shading Accent 1" w:uiPriority="71"/>
+    <w:lsdException w:name="Colorful List Accent 1" w:uiPriority="72"/>
+    <w:lsdException w:name="Colorful Grid Accent 1" w:uiPriority="73"/>
+    <w:lsdException w:name="Light Shading Accent 2" w:uiPriority="60"/>
+    <w:lsdException w:name="Light List Accent 2" w:uiPriority="61"/>
+    <w:lsdException w:name="Light Grid Accent 2" w:uiPriority="62"/>
+    <w:lsdException w:name="Medium Shading 1 Accent 2" w:uiPriority="63"/>
+    <w:lsdException w:name="Medium Shading 2 Accent 2" w:uiPriority="64"/>
+    <w:lsdException w:name="Medium List 1 Accent 2" w:uiPriority="65"/>
+    <w:lsdException w:name="Medium List 2 Accent 2" w:uiPriority="66"/>
+    <w:lsdException w:name="Medium Grid 1 Accent 2" w:uiPriority="67"/>
+    <w:lsdException w:name="Medium Grid 2 Accent 2" w:uiPriority="68"/>
+    <w:lsdException w:name="Medium Grid 3 Accent 2" w:uiPriority="69"/>
+    <w:lsdException w:name="Dark List Accent 2" w:uiPriority="70"/>
+    <w:lsdException w:name="Colorful Shading Accent 2" w:uiPriority="71"/>
+    <w:lsdException w:name="Colorful List Accent 2" w:uiPriority="72"/>
+    <w:lsdException w:name="Colorful Grid Accent 2" w:uiPriority="73"/>
+    <w:lsdException w:name="Light Shading Accent 3" w:uiPriority="60"/>
+    <w:lsdException w:name="Light List Accent 3" w:uiPriority="61"/>
+    <w:lsdException w:name="Light Grid Accent 3" w:uiPriority="62"/>
+    <w:lsdException w:name="Medium Shading 1 Accent 3" w:uiPriority="63"/>
+    <w:lsdException w:name="Medium Shading 2 Accent 3" w:uiPriority="64"/>
+    <w:lsdException w:name="Medium List 1 Accent 3" w:uiPriority="65"/>
+    <w:lsdException w:name="Medium List 2 Accent 3" w:uiPriority="66"/>
+    <w:lsdException w:name="Medium Grid 1 Accent 3" w:uiPriority="67"/>
+    <w:lsdException w:name="Medium Grid 2 Accent 3" w:uiPriority="68"/>
+    <w:lsdException w:name="Medium Grid 3 Accent 3" w:uiPriority="69"/>
+    <w:lsdException w:name="Dark List Accent 3" w:uiPriority="70"/>
+    <w:lsdException w:name="Colorful Shading Accent 3" w:uiPriority="71"/>
+    <w:lsdException w:name="Colorful List Accent 3" w:uiPriority="72"/>
+    <w:lsdException w:name="Colorful Grid Accent 3" w:uiPriority="73"/>
+    <w:lsdException w:name="Light Shading Accent 4" w:uiPriority="60"/>
+    <w:lsdException w:name="Light List Accent 4" w:uiPriority="61"/>
+    <w:lsdException w:name="Light Grid Accent 4" w:uiPriority="62"/>
+    <w:lsdException w:name="Medium Shading 1 Accent 4" w:uiPriority="63"/>
+    <w:lsdException w:name="Medium Shading 2 Accent 4" w:uiPriority="64"/>
+    <w:lsdException w:name="Medium List 1 Accent 4" w:uiPriority="65"/>
+    <w:lsdException w:name="Medium List 2 Accent 4" w:uiPriority="66"/>
+    <w:lsdException w:name="Medium Grid 1 Accent 4" w:uiPriority="67"/>
+    <w:lsdException w:name="Medium Grid 2 Accent 4" w:uiPriority="68"/>
+    <w:lsdException w:name="Medium Grid 3 Accent 4" w:uiPriority="69"/>
+    <w:lsdException w:name="Dark List Accent 4" w:uiPriority="70"/>
+    <w:lsdException w:name="Colorful Shading Accent 4" w:uiPriority="71"/>
+    <w:lsdException w:name="Colorful List Accent 4" w:uiPriority="72"/>
+    <w:lsdException w:name="Colorful Grid Accent 4" w:uiPriority="73"/>
+    <w:lsdException w:name="Light Shading Accent 5" w:uiPriority="60"/>
+    <w:lsdException w:name="Light List Accent 5" w:uiPriority="61"/>
+    <w:lsdException w:name="Light Grid Accent 5" w:uiPriority="62"/>
+    <w:lsdException w:name="Medium Shading 1 Accent 5" w:uiPriority="63"/>
+    <w:lsdException w:name="Medium Shading 2 Accent 5" w:uiPriority="64"/>
+    <w:lsdException w:name="Medium List 1 Accent 5" w:uiPriority="65"/>
+    <w:lsdException w:name="Medium List 2 Accent 5" w:uiPriority="66"/>
+    <w:lsdException w:name="Medium Grid 1 Accent 5" w:uiPriority="67"/>
+    <w:lsdException w:name="Medium Grid 2 Accent 5" w:uiPriority="68"/>
+    <w:lsdException w:name="Medium Grid 3 Accent 5" w:uiPriority="69"/>
+    <w:lsdException w:name="Dark List Accent 5" w:uiPriority="70"/>
+    <w:lsdException w:name="Colorful Shading Accent 5" w:uiPriority="71"/>
+    <w:lsdException w:name="Colorful List Accent 5" w:uiPriority="72"/>
+    <w:lsdException w:name="Colorful Grid Accent 5" w:uiPriority="73"/>
+    <w:lsdException w:name="Light Shading Accent 6" w:uiPriority="60"/>
+    <w:lsdException w:name="Light List Accent 6" w:uiPriority="61"/>
+    <w:lsdException w:name="Light Grid Accent 6" w:uiPriority="62"/>
+    <w:lsdException w:name="Medium Shading 1 Accent 6" w:uiPriority="63"/>
+    <w:lsdException w:name="Medium Shading 2 Accent 6" w:uiPriority="64"/>
+    <w:lsdException w:name="Medium List 1 Accent 6" w:uiPriority="65"/>
+    <w:lsdException w:name="Medium List 2 Accent 6" w:uiPriority="66"/>
+    <w:lsdException w:name="Medium Grid 1 Accent 6" w:uiPriority="67"/>
+    <w:lsdException w:name="Medium Grid 2 Accent 6" w:uiPriority="68"/>
+    <w:lsdException w:name="Medium Grid 3 Accent 6" w:uiPriority="69"/>
+    <w:lsdException w:name="Dark List Accent 6" w:uiPriority="70"/>
+    <w:lsdException w:name="Colorful Shading Accent 6" w:uiPriority="71"/>
+    <w:lsdException w:name="Colorful List Accent 6" w:uiPriority="72"/>
+    <w:lsdException w:name="Colorful Grid Accent 6" w:uiPriority="73"/>
+    <w:lsdException w:name="Subtle Emphasis" w:uiPriority="19" w:qFormat="1"/>
+    <w:lsdException w:name="Intense Emphasis" w:uiPriority="21" w:qFormat="1"/>
+    <w:lsdException w:name="Subtle Reference" w:uiPriority="31" w:qFormat="1"/>
+    <w:lsdException w:name="Intense Reference" w:uiPriority="32" w:qFormat="1"/>
+    <w:lsdException w:name="Book Title" w:uiPriority="33" w:qFormat="1"/>
+    <w:lsdException w:name="Bibliography" w:semiHidden="1" w:uiPriority="37" w:unhideWhenUsed="1"/>
+    <w:lsdException w:name="TOC Heading" w:semiHidden="1" w:uiPriority="39" w:unhideWhenUsed="1" w:qFormat="1"/>
+    <w:lsdException w:name="Plain Table 1" w:uiPriority="41"/>
+    <w:lsdException w:name="Plain Table 2" w:uiPriority="42"/>
+    <w:lsdException w:name="Plain Table 3" w:uiPriority="43"/>
+    <w:lsdException w:name="Plain Table 4" w:uiPriority="44"/>
+    <w:lsdException w:name="Plain Table 5" w:uiPriority="45"/>
+    <w:lsdException w:name="Grid Table Light" w:uiPriority="40"/>
+    <w:lsdException w:name="Grid Table 1 Light" w:uiPriority="46"/>
+    <w:lsdException w:name="Grid Table 2" w:uiPriority="47"/>
+    <w:lsdException w:name="Grid Table 3" w:uiPriority="48"/>
+    <w:lsdException w:name="Grid Table 4" w:uiPriority="49"/>
+    <w:lsdException w:name="Grid Table 5 Dark" w:uiPriority="50"/>
+    <w:lsdException w:name="Grid Table 6 Colorful" w:uiPriority="51"/>
+    <w:lsdException w:name="Grid Table 7 Colorful" w:uiPriority="52"/>
+    <w:lsdException w:name="Grid Table 1 Light Accent 1" w:uiPriority="46"/>
+    <w:lsdException w:name="Grid Table 2 Accent 1" w:uiPriority="47"/>
+    <w:lsdException w:name="Grid Table 3 Accent 1" w:uiPriority="48"/>
+    <w:lsdException w:name="Grid Table 4 Accent 1" w:uiPriority="49"/>
+    <w:lsdException w:name="Grid Table 5 Dark Accent 1" w:uiPriority="50"/>
+    <w:lsdException w:name="Grid Table 6 Colorful Accent 1" w:uiPriority="51"/>
+    <w:lsdException w:name="Grid Table 7 Colorful Accent 1" w:uiPriority="52"/>
+    <w:lsdException w:name="Grid Table 1 Light Accent 2" w:uiPriority="46"/>
+    <w:lsdException w:name="Grid Table 2 Accent 2" w:uiPriority="47"/>
+    <w:lsdException w:name="Grid Table 3 Accent 2" w:uiPriority="48"/>
+    <w:lsdException w:name="Grid Table 4 Accent 2" w:uiPriority="49"/>
+    <w:lsdException w:name="Grid Table 5 Dark Accent 2" w:uiPriority="50"/>
+    <w:lsdException w:name="Grid Table 6 Colorful Accent 2" w:uiPriority="51"/>
+    <w:lsdException w:name="Grid Table 7 Colorful Accent 2" w:uiPriority="52"/>
+    <w:lsdException w:name="Grid Table 1 Light Accent 3" w:uiPriority="46"/>
+    <w:lsdException w:name="Grid Table 2 Accent 3" w:uiPriority="47"/>
+    <w:lsdException w:name="Grid Table 3 Accent 3" w:uiPriority="48"/>
+    <w:lsdException w:name="Grid Table 4 Accent 3" w:uiPriority="49"/>
+    <w:lsdException w:name="Grid Table 5 Dark Accent 3" w:uiPriority="50"/>
+    <w:lsdException w:name="Grid Table 6 Colorful Accent 3" w:uiPriority="51"/>
+    <w:lsdException w:name="Grid Table 7 Colorful Accent 3" w:uiPriority="52"/>
+    <w:lsdException w:name="Grid Table 1 Light Accent 4" w:uiPriority="46"/>
+    <w:lsdException w:name="Grid Table 2 Accent 4" w:uiPriority="47"/>
+    <w:lsdException w:name="Grid Table 3 Accent 4" w:uiPriority="48"/>
+    <w:lsdException w:name="Grid Table 4 Accent 4" w:uiPriority="49"/>
+    <w:lsdException w:name="Grid Table 5 Dark Accent 4" w:uiPriority="50"/>
+    <w:lsdException w:name="Grid Table 6 Colorful Accent 4" w:uiPriority="51"/>
+    <w:lsdException w:name="Grid Table 7 Colorful Accent 4" w:uiPriority="52"/>
+    <w:lsdException w:name="Grid Table 1 Light Accent 5" w:uiPriority="46"/>
+    <w:lsdException w:name="Grid Table 2 Accent 5" w:uiPriority="47"/>
+    <w:lsdException w:name="Grid Table 3 Accent 5" w:uiPriority="48"/>
+    <w:lsdException w:name="Grid Table 4 Accent 5" w:uiPriority="49"/>
+    <w:lsdException w:name="Grid Table 5 Dark Accent 5" w:uiPriority="50"/>
+    <w:lsdException w:name="Grid Table 6 Colorful Accent 5" w:uiPriority="51"/>
+    <w:lsdException w:name="Grid Table 7 Colorful Accent 5" w:uiPriority="52"/>
+    <w:lsdException w:name="Grid Table 1 Light Accent 6" w:uiPriority="46"/>
+    <w:lsdException w:name="Grid Table 2 Accent 6" w:uiPriority="47"/>
+    <w:lsdException w:name="Grid Table 3 Accent 6" w:uiPriority="48"/>
+    <w:lsdException w:name="Grid Table 4 Accent 6" w:uiPriority="49"/>
+    <w:lsdException w:name="Grid Table 5 Dark Accent 6" w:uiPriority="50"/>
+    <w:lsdException w:name="Grid Table 6 Colorful Accent 6" w:uiPriority="51"/>
+    <w:lsdException w:name="Grid Table 7 Colorful Accent 6" w:uiPriority="52"/>
+    <w:lsdException w:name="List Table 1 Light" w:uiPriority="46"/>
+    <w:lsdException w:name="List Table 2" w:uiPriority="47"/>
+    <w:lsdException w:name="List Table 3" w:uiPriority="48"/>
+    <w:lsdException w:name="List Table 4" w:uiPriority="49"/>
+    <w:lsdException w:name="List Table 5 Dark" w:uiPriority="50"/>
+    <w:lsdException w:name="List Table 6 Colorful" w:uiPriority="51"/>
+    <w:lsdException w:name="List Table 7 Colorful" w:uiPriority="52"/>
+    <w:lsdException w:name="List Table 1 Light Accent 1" w:uiPriority="46"/>
+    <w:lsdException w:name="List Table 2 Accent 1" w:uiPriority="47"/>
+    <w:lsdException w:name="List Table 3 Accent 1" w:uiPriority="48"/>
+    <w:lsdException w:name="List Table 4 Accent 1" w:uiPriority="49"/>
+    <w:lsdException w:name="List Table 5 Dark Accent 1" w:uiPriority="50"/>
+    <w:lsdException w:name="List Table 6 Colorful Accent 1" w:uiPriority="51"/>
+    <w:lsdException w:name="List Table 7 Colorful Accent 1" w:uiPriority="52"/>
+    <w:lsdException w:name="List Table 1 Light Accent 2" w:uiPriority="46"/>
+    <w:lsdException w:name="List Table 2 Accent 2" w:uiPriority="47"/>
+    <w:lsdException w:name="List Table 3 Accent 2" w:uiPriority="48"/>
+    <w:lsdException w:name="List Table 4 Accent 2" w:uiPriority="49"/>
+    <w:lsdException w:name="List Table 5 Dark Accent 2" w:uiPriority="50"/>
+    <w:lsdException w:name="List Table 6 Colorful Accent 2" w:uiPriority="51"/>
+    <w:lsdException w:name="List Table 7 Colorful Accent 2" w:uiPriority="52"/>
+    <w:lsdException w:name="List Table 1 Light Accent 3" w:uiPriority="46"/>
+    <w:lsdException w:name="List Table 2 Accent 3" w:uiPriority="47"/>
+    <w:lsdException w:name="List Table 3 Accent 3" w:uiPriority="48"/>
+    <w:lsdException w:name="List Table 4 Accent 3" w:uiPriority="49"/>
+    <w:lsdException w:name="List Table 5 Dark Accent 3" w:uiPriority="50"/>
+    <w:lsdException w:name="List Table 6 Colorful Accent 3" w:uiPriority="51"/>
+    <w:lsdException w:name="List Table 7 Colorful Accent 3" w:uiPriority="52"/>
+    <w:lsdException w:name="List Table 1 Light Accent 4" w:uiPriority="46"/>
+    <w:lsdException w:name="List Table 2 Accent 4" w:uiPriority="47"/>
+    <w:lsdException w:name="List Table 3 Accent 4" w:uiPriority="48"/>
+    <w:lsdException w:name="List Table 4 Accent 4" w:uiPriority="49"/>
+    <w:lsdException w:name="List Table 5 Dark Accent 4" w:uiPriority="50"/>
+    <w:lsdException w:name="List Table 6 Colorful Accent 4" w:uiPriority="51"/>
+    <w:lsdException w:name="List Table 7 Colorful Accent 4" w:uiPriority="52"/>
+    <w:lsdException w:name="List Table 1 Light Accent 5" w:uiPriority="46"/>
+    <w:lsdException w:name="List Table 2 Accent 5" w:uiPriority="47"/>
+    <w:lsdException w:name="List Table 3 Accent 5" w:uiPriority="48"/>
+    <w:lsdException w:name="List Table 4 Accent 5" w:uiPriority="49"/>
+    <w:lsdException w:name="List Table 5 Dark Accent 5" w:uiPriority="50"/>
+    <w:lsdException w:name="List Table 6 Colorful Accent 5" w:uiPriority="51"/>
+    <w:lsdException w:name="List Table 7 Colorful Accent 5" w:uiPriority="52"/>
+    <w:lsdException w:name="List Table 1 Light Accent 6" w:uiPriority="46"/>
+    <w:lsdException w:name="List Table 2 Accent 6" w:uiPriority="47"/>
+    <w:lsdException w:name="List Table 3 Accent 6" w:uiPriority="48"/>
+    <w:lsdException w:name="List Table 4 Accent 6" w:uiPriority="49"/>
+    <w:lsdException w:name="List Table 5 Dark Accent 6" w:uiPriority="50"/>
+    <w:lsdException w:name="List Table 6 Colorful Accent 6" w:uiPriority="51"/>
+    <w:lsdException w:name="List Table 7 Colorful Accent 6" w:uiPriority="52"/>
+    <w:lsdException w:name="Mention" w:semiHidden="1" w:unhideWhenUsed="1"/>
+    <w:lsdException w:name="Smart Hyperlink" w:semiHidden="1" w:unhideWhenUsed="1"/>
+    <w:lsdException w:name="Hashtag" w:semiHidden="1" w:unhideWhenUsed="1"/>
+    <w:lsdException w:name="Unresolved Mention" w:semiHidden="1" w:unhideWhenUsed="1"/>
+    <w:lsdException w:name="Smart Link" w:semiHidden="1" w:unhideWhenUsed="1"/>
+  </w:latentStyles>
+  <w:style w:type="paragraph" w:default="1" w:styleId="a">
+    <w:name w:val="Normal"/>
+    <w:qFormat/>
   </w:style>
-  <w:style w:type="paragraph" w:styleId="Normal" w:default="1">
-    <w:name w:val="normal"/>
-  </w:style>
-  <w:style w:type="paragraph" w:styleId="Heading1">
+  <w:style w:type="paragraph" w:styleId="1">
     <w:name w:val="heading 1"/>
-    <w:basedOn w:val="Normal"/>
-    <w:next w:val="Normal"/>
+    <w:basedOn w:val="a"/>
+    <w:next w:val="a"/>
+    <w:uiPriority w:val="9"/>
+    <w:qFormat/>
     <w:pPr>
-      <w:keepNext w:val="1"/>
-      <w:keepLines w:val="1"/>
-      <w:spacing w:after="120" w:before="480" w:lineRule="auto"/>
+      <w:keepNext/>
+      <w:keepLines/>
+      <w:spacing w:before="480" w:after="120"/>
+      <w:outlineLvl w:val="0"/>
     </w:pPr>
     <w:rPr>
-      <w:b w:val="1"/>
-      <w:bCs w:val="1"/>
+      <w:b/>
+      <w:bCs/>
       <w:sz w:val="48"/>
       <w:szCs w:val="48"/>
     </w:rPr>
   </w:style>
-  <w:style w:type="paragraph" w:styleId="Heading2">
+  <w:style w:type="paragraph" w:styleId="2">
     <w:name w:val="heading 2"/>
-    <w:basedOn w:val="Normal"/>
-    <w:next w:val="Normal"/>
+    <w:basedOn w:val="a"/>
+    <w:next w:val="a"/>
+    <w:uiPriority w:val="9"/>
+    <w:semiHidden/>
+    <w:unhideWhenUsed/>
+    <w:qFormat/>
     <w:pPr>
-      <w:keepNext w:val="1"/>
-      <w:keepLines w:val="1"/>
-      <w:spacing w:after="80" w:before="360" w:lineRule="auto"/>
+      <w:keepNext/>
+      <w:keepLines/>
+      <w:spacing w:before="360" w:after="80"/>
+      <w:outlineLvl w:val="1"/>
     </w:pPr>
     <w:rPr>
-      <w:b w:val="1"/>
-      <w:bCs w:val="1"/>
+      <w:b/>
+      <w:bCs/>
       <w:sz w:val="36"/>
       <w:szCs w:val="36"/>
     </w:rPr>
   </w:style>
-  <w:style w:type="paragraph" w:styleId="Heading3">
+  <w:style w:type="paragraph" w:styleId="3">
     <w:name w:val="heading 3"/>
-    <w:basedOn w:val="Normal"/>
-    <w:next w:val="Normal"/>
+    <w:basedOn w:val="a"/>
+    <w:next w:val="a"/>
+    <w:uiPriority w:val="9"/>
+    <w:semiHidden/>
+    <w:unhideWhenUsed/>
+    <w:qFormat/>
     <w:pPr>
-      <w:keepNext w:val="1"/>
-      <w:keepLines w:val="1"/>
-      <w:spacing w:after="80" w:before="280" w:lineRule="auto"/>
+      <w:keepNext/>
+      <w:keepLines/>
+      <w:spacing w:before="280" w:after="80"/>
+      <w:outlineLvl w:val="2"/>
     </w:pPr>
     <w:rPr>
-      <w:b w:val="1"/>
-      <w:bCs w:val="1"/>
+      <w:b/>
+      <w:bCs/>
       <w:sz w:val="28"/>
       <w:szCs w:val="28"/>
     </w:rPr>
   </w:style>
-  <w:style w:type="paragraph" w:styleId="Heading4">
+  <w:style w:type="paragraph" w:styleId="4">
     <w:name w:val="heading 4"/>
-    <w:basedOn w:val="Normal"/>
-    <w:next w:val="Normal"/>
+    <w:basedOn w:val="a"/>
+    <w:next w:val="a"/>
+    <w:uiPriority w:val="9"/>
+    <w:semiHidden/>
+    <w:unhideWhenUsed/>
+    <w:qFormat/>
     <w:pPr>
-      <w:keepNext w:val="1"/>
-      <w:keepLines w:val="1"/>
-      <w:spacing w:after="40" w:before="240" w:lineRule="auto"/>
+      <w:keepNext/>
+      <w:keepLines/>
+      <w:spacing w:before="240" w:after="40"/>
+      <w:outlineLvl w:val="3"/>
     </w:pPr>
     <w:rPr>
-      <w:b w:val="1"/>
-      <w:bCs w:val="1"/>
+      <w:b/>
+      <w:bCs/>
     </w:rPr>
   </w:style>
-  <w:style w:type="paragraph" w:styleId="Heading5">
+  <w:style w:type="paragraph" w:styleId="5">
     <w:name w:val="heading 5"/>
-    <w:basedOn w:val="Normal"/>
-    <w:next w:val="Normal"/>
+    <w:basedOn w:val="a"/>
+    <w:next w:val="a"/>
+    <w:uiPriority w:val="9"/>
+    <w:semiHidden/>
+    <w:unhideWhenUsed/>
+    <w:qFormat/>
     <w:pPr>
-      <w:keepNext w:val="1"/>
-      <w:keepLines w:val="1"/>
-      <w:spacing w:after="40" w:before="220" w:lineRule="auto"/>
+      <w:keepNext/>
+      <w:keepLines/>
+      <w:spacing w:before="220" w:after="40"/>
+      <w:outlineLvl w:val="4"/>
     </w:pPr>
     <w:rPr>
-      <w:b w:val="1"/>
-      <w:bCs w:val="1"/>
+      <w:b/>
+      <w:bCs/>
       <w:sz w:val="22"/>
       <w:szCs w:val="22"/>
     </w:rPr>
   </w:style>
-  <w:style w:type="paragraph" w:styleId="Heading6">
+  <w:style w:type="paragraph" w:styleId="6">
     <w:name w:val="heading 6"/>
-    <w:basedOn w:val="Normal"/>
-    <w:next w:val="Normal"/>
+    <w:basedOn w:val="a"/>
+    <w:next w:val="a"/>
+    <w:uiPriority w:val="9"/>
+    <w:semiHidden/>
+    <w:unhideWhenUsed/>
+    <w:qFormat/>
     <w:pPr>
-      <w:keepNext w:val="1"/>
-      <w:keepLines w:val="1"/>
-      <w:spacing w:after="40" w:before="200" w:lineRule="auto"/>
+      <w:keepNext/>
+      <w:keepLines/>
+      <w:spacing w:before="200" w:after="40"/>
+      <w:outlineLvl w:val="5"/>
     </w:pPr>
     <w:rPr>
-      <w:b w:val="1"/>
-      <w:bCs w:val="1"/>
+      <w:b/>
+      <w:bCs/>
       <w:sz w:val="20"/>
       <w:szCs w:val="20"/>
     </w:rPr>
   </w:style>
-  <w:style w:type="paragraph" w:styleId="Title">
+  <w:style w:type="character" w:default="1" w:styleId="a0">
+    <w:name w:val="Default Paragraph Font"/>
+    <w:uiPriority w:val="1"/>
+    <w:semiHidden/>
+    <w:unhideWhenUsed/>
+  </w:style>
+  <w:style w:type="table" w:default="1" w:styleId="a1">
+    <w:name w:val="Normal Table"/>
+    <w:uiPriority w:val="99"/>
+    <w:semiHidden/>
+    <w:unhideWhenUsed/>
+    <w:tblPr>
+      <w:tblInd w:w="0" w:type="dxa"/>
+      <w:tblCellMar>
+        <w:top w:w="0" w:type="dxa"/>
+        <w:left w:w="108" w:type="dxa"/>
+        <w:bottom w:w="0" w:type="dxa"/>
+        <w:right w:w="108" w:type="dxa"/>
+      </w:tblCellMar>
+    </w:tblPr>
+  </w:style>
+  <w:style w:type="numbering" w:default="1" w:styleId="a2">
+    <w:name w:val="No List"/>
+    <w:uiPriority w:val="99"/>
+    <w:semiHidden/>
+    <w:unhideWhenUsed/>
+  </w:style>
+  <w:style w:type="table" w:customStyle="1" w:styleId="TableNormal">
+    <w:name w:val="TableNormal"/>
+    <w:tblPr>
+      <w:tblCellMar>
+        <w:top w:w="100" w:type="dxa"/>
+        <w:left w:w="100" w:type="dxa"/>
+        <w:bottom w:w="100" w:type="dxa"/>
+        <w:right w:w="100" w:type="dxa"/>
+      </w:tblCellMar>
+    </w:tblPr>
+  </w:style>
+  <w:style w:type="paragraph" w:styleId="a3">
     <w:name w:val="Title"/>
-    <w:basedOn w:val="Normal"/>
-    <w:next w:val="Normal"/>
+    <w:basedOn w:val="a"/>
+    <w:next w:val="a"/>
+    <w:uiPriority w:val="10"/>
+    <w:qFormat/>
     <w:pPr>
-      <w:keepNext w:val="1"/>
-      <w:keepLines w:val="1"/>
-      <w:spacing w:after="120" w:before="480" w:lineRule="auto"/>
+      <w:keepNext/>
+      <w:keepLines/>
+      <w:spacing w:before="480" w:after="120"/>
     </w:pPr>
     <w:rPr>
-      <w:b w:val="1"/>
-      <w:bCs w:val="1"/>
+      <w:b/>
+      <w:bCs/>
       <w:sz w:val="72"/>
       <w:szCs w:val="72"/>
     </w:rPr>
   </w:style>
-  <w:style w:type="paragraph" w:styleId="Subtitle">
+  <w:style w:type="paragraph" w:styleId="a4">
     <w:name w:val="Subtitle"/>
-    <w:basedOn w:val="Normal"/>
-    <w:next w:val="Normal"/>
+    <w:basedOn w:val="a"/>
+    <w:next w:val="a"/>
+    <w:uiPriority w:val="11"/>
+    <w:qFormat/>
     <w:pPr>
-      <w:keepNext w:val="1"/>
-      <w:keepLines w:val="1"/>
-      <w:spacing w:after="80" w:before="360" w:lineRule="auto"/>
+      <w:keepNext/>
+      <w:keepLines/>
+      <w:spacing w:before="360" w:after="80"/>
     </w:pPr>
     <w:rPr>
-      <w:rFonts w:ascii="Georgia" w:cs="Georgia" w:eastAsia="Georgia" w:hAnsi="Georgia"/>
-      <w:i w:val="1"/>
-      <w:iCs w:val="1"/>
+      <w:rFonts w:ascii="Georgia" w:eastAsia="Georgia" w:hAnsi="Georgia" w:cs="Georgia"/>
+      <w:i/>
+      <w:iCs/>
       <w:color w:val="666666"/>
       <w:sz w:val="48"/>
       <w:szCs w:val="48"/>
@@ -907,17 +1251,17 @@
 </a:theme>
 </file>
 
-<file path=customXML/item1.xml><?xml version="1.0" encoding="utf-8"?>
+<file path=customXml/item1.xml><?xml version="1.0" encoding="utf-8"?>
 <go:gDocsCustomXmlDataStorage xmlns:go="http://customooxmlschemas.google.com/" xmlns:r="http://schemas.openxmlformats.org/officeDocument/2006/relationships" uri="GoogleDocsCustomDataVersion2">
   <go:docsCustomData xmlns:go="http://customooxmlschemas.google.com/" roundtripDataSignature="AMtx7mipF8ynJvcZeuorEjFoWIp6mD3TeA==">CgMxLjAyDmgueWxpOHRpM3hoZmd6OAByITFpSlpHTXhyNF8xUFBicHlEQUhydDBoUUxPMXh2bmRhTw==</go:docsCustomData>
 </go:gDocsCustomXmlDataStorage>
 </file>
 
-<file path=customXML/itemProps1.xml><?xml version="1.0" encoding="utf-8"?>
+<file path=customXml/itemProps1.xml><?xml version="1.0" encoding="utf-8"?>
 <ds:datastoreItem xmlns:ds="http://schemas.openxmlformats.org/officeDocument/2006/customXml" ds:itemID="{11111111-1234-1234-1234-123412341234}">
   <ds:schemaRefs>
+    <ds:schemaRef ds:uri="http://customooxmlschemas.google.com/"/>
     <ds:schemaRef ds:uri="http://schemas.openxmlformats.org/officeDocument/2006/relationships"/>
-    <ds:schemaRef ds:uri="http://customooxmlschemas.google.com/"/>
   </ds:schemaRefs>
 </ds:datastoreItem>
 </file>
</xml_diff>

<commit_message>
feat: add order workflow and admin management
</commit_message>
<xml_diff>
--- a/docs/Отзыв руководителя .docx
+++ b/docs/Отзыв руководителя .docx
@@ -39,7 +39,10 @@
         <w:jc w:val="both"/>
       </w:pPr>
       <w:r>
-        <w:t>Вид практики: Учебная  практика</w:t>
+        <w:t xml:space="preserve">Вид практики: </w:t>
+      </w:r>
+      <w:r>
+        <w:t>Учебная практика</w:t>
       </w:r>
     </w:p>
     <w:p>
@@ -57,15 +60,7 @@
         <w:jc w:val="both"/>
       </w:pPr>
       <w:r>
-        <w:t xml:space="preserve">Организация: УрФУ </w:t>
-      </w:r>
-      <w:proofErr w:type="spellStart"/>
-      <w:r>
-        <w:t>ИнФО</w:t>
-      </w:r>
-      <w:proofErr w:type="spellEnd"/>
-      <w:r>
-        <w:t xml:space="preserve"> кафедра интеллектуальных информационных технологий</w:t>
+        <w:t>Организация: УрФУ ИнФО кафедра интеллектуальных информационных технологий</w:t>
       </w:r>
     </w:p>
     <w:p>
@@ -94,7 +89,13 @@
       <w:bookmarkStart w:id="0" w:name="_heading=h.yli8ti3xhfgz" w:colFirst="0" w:colLast="0"/>
       <w:bookmarkEnd w:id="0"/>
       <w:r>
-        <w:t>с 29.06.2026  по 12.07.2026</w:t>
+        <w:t xml:space="preserve">с </w:t>
+      </w:r>
+      <w:r>
+        <w:t>29.06.2026 по</w:t>
+      </w:r>
+      <w:r>
+        <w:t xml:space="preserve"> 12.07.2026</w:t>
       </w:r>
     </w:p>
     <w:p>
@@ -113,6 +114,9 @@
         <w:spacing w:line="360" w:lineRule="auto"/>
         <w:ind w:right="147"/>
         <w:jc w:val="both"/>
+        <w:rPr>
+          <w:lang w:val="en-US"/>
+        </w:rPr>
       </w:pPr>
       <w:r>
         <w:t xml:space="preserve">Студент </w:t>
@@ -135,41 +139,93 @@
       <w:r>
         <w:t xml:space="preserve"> института ИРИТ-РТФ за время прохождения практики осуществил следующие мероприятия</w:t>
       </w:r>
-    </w:p>
-    <w:p>
-      <w:pPr>
-        <w:spacing w:line="360" w:lineRule="auto"/>
+      <w:r>
+        <w:rPr>
+          <w:lang w:val="ru-RU"/>
+        </w:rPr>
+        <w:t>:</w:t>
+      </w:r>
+    </w:p>
+    <w:p>
+      <w:pPr>
+        <w:spacing w:line="360" w:lineRule="auto"/>
+        <w:ind w:right="147"/>
         <w:jc w:val="both"/>
-      </w:pPr>
-      <w:r>
         <w:rPr>
           <w:u w:val="single"/>
-        </w:rPr>
-        <w:t xml:space="preserve">изучил структуру веб-приложения, участвовал в разработке и доработке пользовательского интерфейса, реализовывал страницы личного кабинета, корзины, бонусной программы и оформления заказа, работал с компонентами </w:t>
-      </w:r>
-      <w:proofErr w:type="spellStart"/>
+          <w:lang w:val="ru-RU"/>
+        </w:rPr>
+      </w:pPr>
       <w:r>
         <w:rPr>
           <w:u w:val="single"/>
-        </w:rPr>
-        <w:t>React</w:t>
-      </w:r>
-      <w:proofErr w:type="spellEnd"/>
-      <w:r>
+          <w:lang w:val="ru-RU"/>
+        </w:rPr>
+        <w:t>изучил архитектуру и структуру веб-приложения интернет-магазина; участвовал в разработке и доработке пользовательского и административного интерфейсов; реализовал страницы каталога, карточки товара, корзины, избранного, оформления заказа, личного кабинета и бонусной программы; работал с React, Next.js, TypeScript, SCSS и Zustand.</w:t>
+      </w:r>
+    </w:p>
+    <w:p>
+      <w:pPr>
+        <w:spacing w:line="360" w:lineRule="auto"/>
+        <w:ind w:right="147"/>
+        <w:jc w:val="both"/>
         <w:rPr>
           <w:u w:val="single"/>
-        </w:rPr>
-        <w:t>/Next.js, стилями SCSS, обработкой пользовательских данных и отображением товарных вариантов</w:t>
-      </w:r>
-    </w:p>
-    <w:p>
-      <w:pPr>
-        <w:spacing w:line="360" w:lineRule="auto"/>
-        <w:rPr>
           <w:lang w:val="ru-RU"/>
         </w:rPr>
       </w:pPr>
       <w:r>
+        <w:rPr>
+          <w:u w:val="single"/>
+          <w:lang w:val="ru-RU"/>
+        </w:rPr>
+        <w:t>В ходе практики студент разрабатывал серверные API-маршруты, настраивал авторизацию через NextAuth.js, хеширование паролей с помощью bcryptjs, подтверждение регистрации по электронной почте через Nodemailer и ограничение частоты запросов. Работал с PostgreSQL, Prisma ORM, моделями данных, миграциями и связями между пользователями, университетами, товарами, корзиной, избранным, заявками на верификацию и журналом административных действий.</w:t>
+      </w:r>
+    </w:p>
+    <w:p>
+      <w:pPr>
+        <w:spacing w:line="360" w:lineRule="auto"/>
+        <w:ind w:right="147"/>
+        <w:jc w:val="both"/>
+        <w:rPr>
+          <w:u w:val="single"/>
+          <w:lang w:val="ru-RU"/>
+        </w:rPr>
+      </w:pPr>
+      <w:r>
+        <w:rPr>
+          <w:u w:val="single"/>
+          <w:lang w:val="ru-RU"/>
+        </w:rPr>
+        <w:t>Также студент реализовывал поиск товаров, учёт товарных вариантов и остатков, синхронизацию корзины и избранного, разграничение пользовательских и административных ролей, обработку заявок на подтверждение студенческого статуса и экспорт журнала действий в CSV. Настроил проверку загружаемых файлов, оптимизацию изображений и преобразование их в формат WebP с помощью Sharp, а также загрузку изображений в S3-совместимое объектное хранилище через AWS SDK.</w:t>
+      </w:r>
+    </w:p>
+    <w:p>
+      <w:pPr>
+        <w:spacing w:line="360" w:lineRule="auto"/>
+        <w:ind w:right="147"/>
+        <w:jc w:val="both"/>
+        <w:rPr>
+          <w:u w:val="single"/>
+          <w:lang w:val="ru-RU"/>
+        </w:rPr>
+      </w:pPr>
+      <w:r>
+        <w:rPr>
+          <w:u w:val="single"/>
+          <w:lang w:val="ru-RU"/>
+        </w:rPr>
+        <w:t>Для развёртывания и воспроизводимого запуска приложения студент работал с Docker, Dockerfile и Docker Compose, настраивал контейнеры приложения и PostgreSQL, переменные окружения, сетевое взаимодействие и применение миграций Prisma. Проверял качество программного продукта с помощью автоматических модульных тестов, ESLint, TypeScript и production-сборки Next.js.</w:t>
+      </w:r>
+    </w:p>
+    <w:p>
+      <w:pPr>
+        <w:spacing w:line="360" w:lineRule="auto"/>
+        <w:rPr>
+          <w:lang w:val="ru-RU"/>
+        </w:rPr>
+      </w:pPr>
+      <w:r>
         <w:t xml:space="preserve">В период практики студент </w:t>
       </w:r>
     </w:p>
@@ -184,21 +240,14 @@
         <w:rPr>
           <w:u w:val="single"/>
         </w:rPr>
-        <w:t xml:space="preserve">проявил хороший уровень теоретической подготовки, внимательность к деталям и ответственное отношение к поставленным задачам. Мирошниченко Егор Юрьевич показал умение разбираться в существующем коде, применять современные инструменты </w:t>
-      </w:r>
-      <w:proofErr w:type="spellStart"/>
+        <w:t xml:space="preserve">проявил хороший уровень теоретической подготовки, внимательность к деталям и ответственное отношение к поставленным задачам. Мирошниченко Егор Юрьевич показал умение разбираться в существующем коде, применять современные инструменты frontend-разработки, аккуратно вносить изменения и проверять результат работы. К выполнению заданий относился добросовестно, соблюдал сроки, проявлял </w:t>
+      </w:r>
       <w:r>
         <w:rPr>
           <w:u w:val="single"/>
         </w:rPr>
-        <w:t>frontend</w:t>
-      </w:r>
-      <w:proofErr w:type="spellEnd"/>
-      <w:r>
-        <w:rPr>
-          <w:u w:val="single"/>
-        </w:rPr>
-        <w:t>-разработки, аккуратно вносить изменения и проверять результат работы. К выполнению заданий относился добросовестно, соблюдал сроки, проявлял самостоятельность и заинтересованность в повышении качества разрабатываемого программного продукта</w:t>
+        <w:lastRenderedPageBreak/>
+        <w:t>самостоятельность и заинтересованность в повышении качества разрабатываемого программного продукта</w:t>
       </w:r>
     </w:p>
     <w:p>
@@ -251,7 +300,16 @@
         <w:spacing w:line="360" w:lineRule="auto"/>
       </w:pPr>
       <w:r>
-        <w:t>«10» июля 2026 г.</w:t>
+        <w:t>«1</w:t>
+      </w:r>
+      <w:r>
+        <w:rPr>
+          <w:lang w:val="ru-RU"/>
+        </w:rPr>
+        <w:t>2</w:t>
+      </w:r>
+      <w:r>
+        <w:t>» июля 2026 г.</w:t>
       </w:r>
     </w:p>
     <w:p>

</xml_diff>